<commit_message>
Finished 100 json files
</commit_message>
<xml_diff>
--- a/Assignment_2.docx
+++ b/Assignment_2.docx
@@ -29,6 +29,474 @@
       </w:r>
       <w:r/>
     </w:p>
+    <w:tbl>
+      <w:tblPr>
+        <w:tblStyle w:val="12"/>
+        <w:tblW w:w="0" w:type="auto"/>
+        <w:tblBorders/>
+        <w:tblLook w:val="04A0" w:firstRow="1" w:lastRow="0" w:firstColumn="1" w:lastColumn="0" w:noHBand="0" w:noVBand="1"/>
+      </w:tblPr>
+      <w:tblGrid>
+        <w:gridCol w:w="1872"/>
+        <w:gridCol w:w="1872"/>
+        <w:gridCol w:w="1872"/>
+        <w:gridCol w:w="1872"/>
+        <w:gridCol w:w="1872"/>
+      </w:tblGrid>
+      <w:tr>
+        <w:trPr/>
+        <w:tc>
+          <w:tcPr>
+            <w:tcBorders/>
+            <w:tcW w:w="1872" w:type="dxa"/>
+          </w:tcPr>
+          <w:p>
+            <w:pPr>
+              <w:pStyle w:val="141"/>
+              <w:pBdr/>
+              <w:spacing/>
+              <w:ind/>
+              <w:rPr/>
+            </w:pPr>
+            <w:r/>
+            <w:r>
+              <w:t xml:space="preserve">Format</w:t>
+            </w:r>
+            <w:r/>
+            <w:r/>
+          </w:p>
+        </w:tc>
+        <w:tc>
+          <w:tcPr>
+            <w:tcBorders/>
+            <w:tcW w:w="1872" w:type="dxa"/>
+          </w:tcPr>
+          <w:p>
+            <w:pPr>
+              <w:pStyle w:val="141"/>
+              <w:pBdr/>
+              <w:spacing/>
+              <w:ind/>
+              <w:rPr/>
+            </w:pPr>
+            <w:r/>
+            <w:r>
+              <w:t xml:space="preserve">MessagePack</w:t>
+            </w:r>
+            <w:r/>
+            <w:r/>
+          </w:p>
+        </w:tc>
+        <w:tc>
+          <w:tcPr>
+            <w:tcBorders/>
+            <w:tcW w:w="1872" w:type="dxa"/>
+          </w:tcPr>
+          <w:p>
+            <w:pPr>
+              <w:pStyle w:val="141"/>
+              <w:pBdr/>
+              <w:spacing/>
+              <w:ind/>
+              <w:rPr/>
+            </w:pPr>
+            <w:r/>
+            <w:r>
+              <w:t xml:space="preserve">Avro</w:t>
+            </w:r>
+            <w:r/>
+            <w:r/>
+          </w:p>
+        </w:tc>
+        <w:tc>
+          <w:tcPr>
+            <w:tcBorders/>
+            <w:tcW w:w="1872" w:type="dxa"/>
+          </w:tcPr>
+          <w:p>
+            <w:pPr>
+              <w:pStyle w:val="141"/>
+              <w:pBdr/>
+              <w:spacing/>
+              <w:ind/>
+              <w:rPr/>
+            </w:pPr>
+            <w:r/>
+            <w:r>
+              <w:t xml:space="preserve">Protobuff</w:t>
+            </w:r>
+            <w:r/>
+            <w:r/>
+          </w:p>
+        </w:tc>
+        <w:tc>
+          <w:tcPr>
+            <w:tcBorders/>
+            <w:tcW w:w="1872" w:type="dxa"/>
+          </w:tcPr>
+          <w:p>
+            <w:pPr>
+              <w:pStyle w:val="141"/>
+              <w:pBdr/>
+              <w:spacing/>
+              <w:ind/>
+              <w:rPr/>
+            </w:pPr>
+            <w:r/>
+            <w:r>
+              <w:t xml:space="preserve">Thrift</w:t>
+            </w:r>
+            <w:r/>
+            <w:r/>
+          </w:p>
+        </w:tc>
+      </w:tr>
+      <w:tr>
+        <w:trPr/>
+        <w:tc>
+          <w:tcPr>
+            <w:tcBorders/>
+            <w:tcW w:w="1872" w:type="dxa"/>
+          </w:tcPr>
+          <w:p>
+            <w:pPr>
+              <w:pStyle w:val="141"/>
+              <w:pBdr/>
+              <w:spacing/>
+              <w:ind/>
+              <w:rPr/>
+            </w:pPr>
+            <w:r/>
+            <w:r>
+              <w:t xml:space="preserve">Original Size</w:t>
+            </w:r>
+            <w:r/>
+            <w:r/>
+          </w:p>
+        </w:tc>
+        <w:tc>
+          <w:tcPr>
+            <w:tcBorders/>
+            <w:tcW w:w="1872" w:type="dxa"/>
+          </w:tcPr>
+          <w:p>
+            <w:pPr>
+              <w:pBdr/>
+              <w:spacing/>
+              <w:ind/>
+              <w:rPr/>
+            </w:pPr>
+            <w:r/>
+            <w:r>
+              <w:t xml:space="preserve">613 bytes</w:t>
+            </w:r>
+            <w:r/>
+            <w:r/>
+          </w:p>
+        </w:tc>
+        <w:tc>
+          <w:tcPr>
+            <w:tcBorders/>
+            <w:tcW w:w="1872" w:type="dxa"/>
+          </w:tcPr>
+          <w:p>
+            <w:pPr>
+              <w:pBdr/>
+              <w:spacing/>
+              <w:ind/>
+              <w:rPr/>
+            </w:pPr>
+            <w:r/>
+            <w:r>
+              <w:t xml:space="preserve">613 bytes</w:t>
+            </w:r>
+            <w:r/>
+            <w:r/>
+          </w:p>
+          <w:p>
+            <w:pPr>
+              <w:pStyle w:val="141"/>
+              <w:pBdr/>
+              <w:spacing/>
+              <w:ind/>
+              <w:rPr/>
+            </w:pPr>
+            <w:r/>
+            <w:r/>
+          </w:p>
+        </w:tc>
+        <w:tc>
+          <w:tcPr>
+            <w:tcBorders/>
+            <w:tcW w:w="1872" w:type="dxa"/>
+          </w:tcPr>
+          <w:p>
+            <w:pPr>
+              <w:pBdr/>
+              <w:spacing/>
+              <w:ind/>
+              <w:rPr/>
+            </w:pPr>
+            <w:r/>
+            <w:r>
+              <w:t xml:space="preserve">613 bytes</w:t>
+            </w:r>
+            <w:r/>
+            <w:r/>
+          </w:p>
+          <w:p>
+            <w:pPr>
+              <w:pStyle w:val="141"/>
+              <w:pBdr/>
+              <w:spacing/>
+              <w:ind/>
+              <w:rPr/>
+            </w:pPr>
+            <w:r/>
+            <w:r/>
+          </w:p>
+        </w:tc>
+        <w:tc>
+          <w:tcPr>
+            <w:tcBorders/>
+            <w:tcW w:w="1872" w:type="dxa"/>
+          </w:tcPr>
+          <w:p>
+            <w:pPr>
+              <w:pBdr/>
+              <w:spacing/>
+              <w:ind/>
+              <w:rPr/>
+            </w:pPr>
+            <w:r/>
+            <w:r>
+              <w:t xml:space="preserve">613 bytes</w:t>
+            </w:r>
+            <w:r/>
+            <w:r/>
+          </w:p>
+          <w:p>
+            <w:pPr>
+              <w:pStyle w:val="141"/>
+              <w:pBdr/>
+              <w:spacing/>
+              <w:ind/>
+              <w:rPr/>
+            </w:pPr>
+            <w:r/>
+            <w:r/>
+          </w:p>
+        </w:tc>
+      </w:tr>
+      <w:tr>
+        <w:trPr/>
+        <w:tc>
+          <w:tcPr>
+            <w:tcBorders/>
+            <w:tcW w:w="1872" w:type="dxa"/>
+          </w:tcPr>
+          <w:p>
+            <w:pPr>
+              <w:pStyle w:val="141"/>
+              <w:pBdr/>
+              <w:spacing/>
+              <w:ind/>
+              <w:rPr/>
+            </w:pPr>
+            <w:r/>
+            <w:r>
+              <w:t xml:space="preserve">1 message file size</w:t>
+            </w:r>
+            <w:r/>
+            <w:r/>
+          </w:p>
+        </w:tc>
+        <w:tc>
+          <w:tcPr>
+            <w:tcBorders/>
+            <w:tcW w:w="1872" w:type="dxa"/>
+          </w:tcPr>
+          <w:p>
+            <w:pPr>
+              <w:pBdr/>
+              <w:spacing/>
+              <w:ind/>
+              <w:rPr/>
+            </w:pPr>
+            <w:r/>
+            <w:r>
+              <w:t xml:space="preserve">451 bytes</w:t>
+            </w:r>
+            <w:r/>
+            <w:r/>
+          </w:p>
+        </w:tc>
+        <w:tc>
+          <w:tcPr>
+            <w:tcBorders/>
+            <w:tcW w:w="1872" w:type="dxa"/>
+          </w:tcPr>
+          <w:p>
+            <w:pPr>
+              <w:pBdr/>
+              <w:spacing/>
+              <w:ind/>
+              <w:rPr/>
+            </w:pPr>
+            <w:r/>
+            <w:r>
+              <w:t xml:space="preserve">770 bytes</w:t>
+            </w:r>
+            <w:r/>
+            <w:r/>
+          </w:p>
+        </w:tc>
+        <w:tc>
+          <w:tcPr>
+            <w:tcBorders/>
+            <w:tcW w:w="1872" w:type="dxa"/>
+          </w:tcPr>
+          <w:p>
+            <w:pPr>
+              <w:pBdr/>
+              <w:spacing/>
+              <w:ind/>
+              <w:rPr/>
+            </w:pPr>
+            <w:r/>
+            <w:r>
+              <w:t xml:space="preserve">402 bytes</w:t>
+            </w:r>
+            <w:r/>
+            <w:r/>
+          </w:p>
+        </w:tc>
+        <w:tc>
+          <w:tcPr>
+            <w:tcBorders/>
+            <w:tcW w:w="1872" w:type="dxa"/>
+          </w:tcPr>
+          <w:p>
+            <w:pPr>
+              <w:pBdr/>
+              <w:spacing/>
+              <w:ind/>
+              <w:rPr/>
+            </w:pPr>
+            <w:r/>
+            <w:r>
+              <w:t xml:space="preserve">497 bytes</w:t>
+            </w:r>
+            <w:r/>
+            <w:r/>
+          </w:p>
+        </w:tc>
+      </w:tr>
+      <w:tr>
+        <w:trPr/>
+        <w:tc>
+          <w:tcPr>
+            <w:tcBorders/>
+            <w:tcW w:w="1872" w:type="dxa"/>
+          </w:tcPr>
+          <w:p>
+            <w:pPr>
+              <w:pStyle w:val="141"/>
+              <w:pBdr/>
+              <w:spacing/>
+              <w:ind/>
+              <w:rPr/>
+            </w:pPr>
+            <w:r/>
+            <w:r>
+              <w:t xml:space="preserve">100 messages file size</w:t>
+            </w:r>
+            <w:r/>
+            <w:r/>
+          </w:p>
+        </w:tc>
+        <w:tc>
+          <w:tcPr>
+            <w:tcBorders/>
+            <w:tcW w:w="1872" w:type="dxa"/>
+          </w:tcPr>
+          <w:p>
+            <w:pPr>
+              <w:pBdr/>
+              <w:spacing/>
+              <w:ind/>
+              <w:rPr/>
+            </w:pPr>
+            <w:r/>
+            <w:r>
+              <w:t xml:space="preserve">45103 bytes</w:t>
+            </w:r>
+            <w:r/>
+            <w:r/>
+          </w:p>
+        </w:tc>
+        <w:tc>
+          <w:tcPr>
+            <w:tcBorders/>
+            <w:tcW w:w="1872" w:type="dxa"/>
+          </w:tcPr>
+          <w:p>
+            <w:pPr>
+              <w:pBdr/>
+              <w:spacing/>
+              <w:ind/>
+              <w:rPr/>
+            </w:pPr>
+            <w:r/>
+            <w:r>
+              <w:t xml:space="preserve">32669 bytes</w:t>
+            </w:r>
+            <w:r/>
+            <w:r/>
+          </w:p>
+        </w:tc>
+        <w:tc>
+          <w:tcPr>
+            <w:tcBorders/>
+            <w:tcW w:w="1872" w:type="dxa"/>
+          </w:tcPr>
+          <w:p>
+            <w:pPr>
+              <w:pBdr/>
+              <w:spacing/>
+              <w:ind/>
+              <w:rPr/>
+            </w:pPr>
+            <w:r/>
+            <w:r>
+              <w:t xml:space="preserve">40200 bytes</w:t>
+            </w:r>
+            <w:r/>
+            <w:r/>
+          </w:p>
+        </w:tc>
+        <w:tc>
+          <w:tcPr>
+            <w:tcBorders/>
+            <w:tcW w:w="1872" w:type="dxa"/>
+          </w:tcPr>
+          <w:p>
+            <w:pPr>
+              <w:pBdr/>
+              <w:spacing/>
+              <w:ind/>
+              <w:rPr/>
+            </w:pPr>
+            <w:r/>
+            <w:r>
+              <w:t xml:space="preserve">49700 bytes</w:t>
+            </w:r>
+            <w:r/>
+            <w:r/>
+          </w:p>
+        </w:tc>
+      </w:tr>
+    </w:tbl>
     <w:p>
       <w:pPr>
         <w:pStyle w:val="141"/>

</xml_diff>